<commit_message>
Guide v9 after external review (catalogue reconciliation, worked E, identity vs accuracy, thresholds, timeline fixes); Plan Rev10 wording
Co-Authored-By: Claude Sonnet 5.5 <noreply@anthropic.com>
</commit_message>
<xml_diff>
--- a/docs/Nanopore_Metagenomics_Project_Plan_Rev10.docx
+++ b/docs/Nanopore_Metagenomics_Project_Plan_Rev10.docx
@@ -1162,7 +1162,7 @@
         <w:t xml:space="preserve">Sylph abundance diagnostic (exploratory, development pool only; 18 October 2026; not a registered arm and part of no verdict; scripts bin/14 to bin/17, outputs in reports/sylph/dev_diagnostic and reports/kraken_bases): </w:t>
       </w:r>
       <w:r>
-        <w:t>Escherichia coli: the sample’s five strains are not in GTDB and each is about 96 to 97% ANI to several database genomes; Sylph reported three E. coli genomes, each carrying roughly the whole E. coli coverage (25.0, 24.0 and 15.3 against about 29 expected), with 6,704 and 6,529 k-mers reassigned between two of them, so the registered rule (sum over a mock species’ genome rows) counted the same reads about 2.5 times; keeping only the best-covered genome per species (post hoc what-if) gives 1.15 instead of 2.34 and Bray–Curtis among called mock species 0.182 instead of 0.240. Limosilactobacillus fermentum: the hypothesis written and committed before its first run (read errors reduce intact 31-mers, so error-rich species show lower effective coverage) was refuted: mean read identity (minimap2’s approximate estimate; base-level accuracy is higher, about 0.98 to 0.99, see the resistance-gene pilot below) was 90.2 to 93.6% in all 13 species, rho 0.23 between 31-mer survival and Sylph over mapped coverage (required at least 0.6), identity gap under 1 point (about 4 needed). The cause was read length, found post hoc in the same table: mean read length is 1.9 kb for L. fermentum, 3.1 kb for F. prausnitzii, 4.3 kb for Roseburia and Fusobacterium and 6 to 8 kb for the others, and the earlier calculation had assumed the pool mean (5,491 bp) for every species. With each species’ own length, Sylph’s True_cov divided by coverage from the assigned bases has median 1.05 (0.97 to 1.32) and Eff_cov divided by coverage 0.78 (0.72 to 0.97): Sylph tracks the DNA actually sequenced, and the manufacturer’s composition is a share of DNA mass. In bases L. fermentum is about 0.65 of its nominal share (1.89 in read shares). Kraken2 recounted in bases (same calls and threshold, bin/17): Bray–Curtis 0.166 on reads, 0.191 on bases; L. fermentum 1.99 to 0.69, F. prausnitzii 1.47 to 0.81, Roseburia 0.50 to 0.38; the gap to Sylph (0.240) shrinks from 0.075 to 0.051, so Kraken2 stays ahead on abundance by a smaller margin. Caveats: Kraken2’s species-level reads are longer than the reads that map to the same species (for example E. coli 9,365 against 7,256 bp), so its base shares carry a length bias; read length is the full read; the Sylph and Kraken2 species sets differ (13 and 14 mock species); one sample. Why species differ in read length (extraction, library preparation or the sample) is unresolved. The registered verdicts are unchanged.</w:t>
+        <w:t>Escherichia coli: the sample’s five strains are not in GTDB and each is about 96 to 97% ANI to several database genomes; Sylph reported three E. coli genomes, each carrying roughly the whole E. coli coverage (25.0, 24.0 and 15.3 against about 29 expected), with 6,704 and 6,529 k-mers reassigned between two of them, so the registered rule (sum over a mock species’ genome rows) counted the same reads about 2.5 times; keeping only the best-covered genome per species (post hoc what-if) gives 1.15 instead of 2.34 and Bray–Curtis among called mock species 0.182 instead of 0.240. Limosilactobacillus fermentum: the hypothesis written and committed before its first run (read errors reduce intact 31-mers, so error-rich species show lower effective coverage) was refuted: mean read identity (minimap2’s approximate estimate; letter-by-letter identity to the reference genes is higher, about 0.98 to 0.99 at the resistance-gene loci, see the pilot below; identity to a reference is a proxy for sequencing accuracy, not a direct measurement of it) was 90.2 to 93.6% in all 13 species, rho 0.23 between 31-mer survival and Sylph over mapped coverage (required at least 0.6), identity gap under 1 point (about 4 needed). The cause was read length, found post hoc in the same table: mean read length is 1.9 kb for L. fermentum, 3.1 kb for F. prausnitzii, 4.3 kb for Roseburia and Fusobacterium and 6 to 8 kb for the others, and the earlier calculation had assumed the pool mean (5,491 bp) for every species. With each species’ own length, Sylph’s True_cov divided by coverage from the assigned bases has median 1.05 (0.97 to 1.32) and Eff_cov divided by coverage 0.78 (0.72 to 0.97): Sylph tracks the DNA actually sequenced, and the manufacturer’s composition is a share of DNA mass. In bases L. fermentum is about 0.65 of its nominal share (1.89 in read shares). Kraken2 recounted in bases (same calls and threshold, bin/17): Bray–Curtis 0.166 on reads, 0.191 on bases; L. fermentum 1.99 to 0.69, F. prausnitzii 1.47 to 0.81, Roseburia 0.50 to 0.38; the gap to Sylph (0.240) shrinks from 0.075 to 0.051, so Kraken2 stays ahead on abundance by a smaller margin. Caveats: Kraken2’s species-level reads are longer than the reads that map to the same species (for example E. coli 9,365 against 7,256 bp), so its base shares carry a length bias; read length is the full read; the Sylph and Kraken2 species sets differ (13 and 14 mock species); one sample. Why species differ in read length (extraction, library preparation or the sample) is unresolved. The registered verdicts are unchanged.</w:t>
       </w:r>
     </w:p>
     <w:p>
@@ -1190,7 +1190,7 @@
         <w:t xml:space="preserve">Resistance-gene pilot (Addenda A3 to A7; decisions D20 to D24; tags amr-registered, amr-a4-registered, amr-map-registered, amr-a5-registered, amr-frozen, amr-eval-scored, amr-a7-registered, amr-a7-eval-scored; scripts bin/19 to bin/25; 18 to 19 October 2026): </w:t>
       </w:r>
       <w:r>
-        <w:t xml:space="preserve">Truth is a reference catalogue, not biological truth: AMRFinderPlus 4.0.23 (database 2025-07-16.1) annotated the supplier genomes (the Argo paper’s expected ARG abundances were built the same way, against SARG+). 140 raw hits were categorised by rules fixed before the hits were seen: 38 AMR or point-mutation rows, 8 high-confidence and 30 candidate (plus-scope, efflux-like, partial and point-mutation rows; acquired versus intrinsic is not separated automatically). Collapsed to species and gene symbol, that is 22 units: 8 high-confidence and 14 candidate. Detectability came before any miss was declared: carrier-species coverage on the development pool gives an expected number of supporting reads E (reads overlapping at least 80% of the gene; E of 10 or more counts as evaluable). One read-level arm: minimap2 of reads against ResFinder (commit eecf0aa, a source different from the truth annotation but not independent of it), gene-family level only (alignment identity at least 0.80, at least 80% of the gene covered, at least 3 supporting reads; ambiguous reads do not count). First arm (A4 to A6): the identity was read from minimap2’s default output, which is an anchor-based estimate and not a base-level alignment; this was recognised only later. Development result: 2 of 3 evaluable families detected; cepA, with 27 ambiguous reads, was missed. An exploratory check showed the four ResFinder names (cepA, cepA-29, -44, -49) are 98.8 to 99.7% identical, so the miss was a naming artefact of my family rule; Addendum A5 merged them by an explicit list written after seeing that result (disclosed). Held-out pool, scored once after the freeze (A6): all five registered predictions met; cepA, tet(Q) and tet(W) each detected (17, 22 and 14 supporting reads), nothing outside the catalogue reached 3 reads. Support for tet(Q) and tet(W) was well below the planning value E. Three exploratory checks (bin/23 to bin/25, development pool only, hypotheses committed before each run, part of no verdict): the genes are covered by reads at about the expected depth (reads over the gene divided by E: 1.02 tet(Q), 1.15 cepA, 0.88 tet(W)); the supplier genes are within 2 to 3% of the best database alleles; but the B. fragilis tet(Q) reads had an estimated identity of 0.775 against the allele and 0.968 when aligned base by base. The registered hypothesis that the filter had used an approximation rather than the sequence was met. Addendum A7 (D24; registered and frozen before any run; predictions fixed beforehand): the same rules with identity from a base-level alignment (minimap2 -c). Development: cepA 36, tet(Q) 47, tet(W) 18 supporting reads; held-out pool, scored once: 22, 51 and 16; six of six development and five of five evaluation predictions met; nothing outside the catalogue; support is 0.83 to 1.12 of E on development and 0.69 to 1.00 on the evaluation pool. By the reporting rule fixed in A7 these counts are the headline and the A4 to A6 counts are kept beside them as the registered earlier arm. Reading: three evaluable families make this a worked example of the workflow, not an accuracy estimate; A7 on the evaluation pool is a prospectively specified replication with a corrected metric, not an independent test (the correction was motivated by development data, the evaluation pool had been scored under A6, and both pools come from one run). All 14 candidate units and 2 of the 8 high-confidence ones (lnu(AN2), blaCDD) are absent from ResFinder under an exact symbol match, erm(B) has too little carrier coverage to score, and the carrier of lsa(A), Enterococcus faecalis, is not in the development read trace. The figure ‘read identity about 91%’ used earlier (A4, bin/15) was the approximate estimate; at these loci base-level read identity is 0.98 to 0.99. A read-level hit is sequence evidence: it does not identify the host organism, an acquired determinant or a resistant phenotype.</w:t>
+        <w:t xml:space="preserve">Truth is a reference catalogue, not biological truth: AMRFinderPlus 4.0.23 (database 2025-07-16.1) annotated the supplier genomes (the Argo paper’s expected ARG abundances were built the same way, against SARG+). 140 raw hits were categorised by rules fixed before the hits were seen: 38 AMR or point-mutation rows, 8 high-confidence and 30 candidate (plus-scope, efflux-like, partial and point-mutation rows; acquired versus intrinsic is not separated automatically). Collapsed to species and gene symbol, that is 22 units: 8 high-confidence and 14 candidate. Detectability came before any miss was declared: carrier-species coverage on the development pool gives an expected number of supporting reads E (reads overlapping at least 80% of the gene; E of 10 or more counts as evaluable). One read-level arm: minimap2 of reads against ResFinder (commit eecf0aa, a source different from the truth annotation but not independent of it), gene-family level only (alignment identity at least 0.80, at least 80% of the gene covered, at least 3 supporting reads; ambiguous reads do not count). First arm (A4 to A6): the identity was read from minimap2’s default output, which is an anchor-based estimate and not a base-level alignment; this was recognised only later. Development result: 2 of 3 evaluable families detected; cepA, with 27 ambiguous reads, was missed. An exploratory check showed the four ResFinder names (cepA, cepA-29, -44, -49) are 98.8 to 99.7% identical, so the miss was a naming artefact of my family rule; Addendum A5 merged them by an explicit list written after seeing that result (disclosed). Held-out pool, scored once after the freeze (A6): all five registered predictions met; cepA, tet(Q) and tet(W) each detected (17, 22 and 14 supporting reads), nothing outside the catalogue reached 3 reads. Support for tet(Q) and tet(W) was well below the planning value E. Three exploratory checks (bin/23 to bin/25, development pool only, hypotheses committed before each run, part of no verdict): the genes are covered by reads at about the expected depth (reads over the gene divided by E: 1.02 tet(Q), 1.15 cepA, 0.88 tet(W)); the supplier genes are within 2 to 3% of the best database alleles; but the B. fragilis tet(Q) reads had an estimated identity of 0.775 against the allele and 0.968 when aligned base by base. The registered hypothesis that the filter had used an approximation rather than the sequence was met. Addendum A7 (D24; registered and frozen before any run; predictions fixed beforehand): the same rules with identity from a base-level alignment (minimap2 -c). Development: cepA 36, tet(Q) 47, tet(W) 18 supporting reads; held-out pool, scored once: 22, 51 and 16; six of six development and five of five evaluation predictions met; nothing outside the catalogue; support is 0.83 to 1.12 of E on development and 0.69 to 1.00 on the evaluation pool. By the reporting rule fixed in A7 these counts are the headline and the A4 to A6 counts are kept beside them as the registered earlier arm. Reading: three evaluable families make this a worked example of the workflow, not an accuracy estimate; A7 on the evaluation pool is a prospectively specified replication with a corrected metric, not an independent test (the correction was motivated by development data, the evaluation pool had been scored under A6, and both pools come from one run). All 14 candidate units and 2 of the 8 high-confidence ones (lnu(AN2), blaCDD) are absent from ResFinder under an exact symbol match, erm(B) has too little carrier coverage to score, and the carrier of lsa(A), Enterococcus faecalis, is not in the development read trace. The figure ‘read identity about 91%’ used earlier (A4, bin/15) was the approximate estimate; at these loci the base-level identity of reads to the supplier genes is 0.98 to 0.99 (a proxy for sequencing accuracy, not a direct measurement of it). A read-level hit is sequence evidence: it does not identify the host organism, an acquired determinant or a resistant phenotype.</w:t>
       </w:r>
     </w:p>
     <w:p>

</xml_diff>